<commit_message>
docs(entrega2): use a hex pairing secret in the cybersecurity report
</commit_message>
<xml_diff>
--- a/documentos/Entrega2/Redes de Computadores e Cibersegurança/Entrega-2-Relatorio-de-Mitigacao-de-Riscos-Smash.docx
+++ b/documentos/Entrega2/Redes de Computadores e Cibersegurança/Entrega-2-Relatorio-de-Mitigacao-de-Riscos-Smash.docx
@@ -4971,6 +4971,30 @@
           <w:szCs w:val="24"/>
         </w:rPr>
         <w:t xml:space="preserve">openssl rand -base64 18</w:t>
+      </w:r>
+      <w:r>
+        <w:rPr>
+          <w:rFonts w:ascii="Arial" w:cs="Arial" w:eastAsia="Arial" w:hAnsi="Arial"/>
+          <w:b w:val="0"/>
+          <w:bCs w:val="0"/>
+          <w:color w:val="242424"/>
+          <w:sz w:val="24"/>
+          <w:szCs w:val="24"/>
+        </w:rPr>
+        <w:t xml:space="preserve"> e </w:t>
+      </w:r>
+      <w:r>
+        <w:rPr>
+          <w:rFonts w:ascii="Arial" w:cs="Arial" w:eastAsia="Arial" w:hAnsi="Arial"/>
+          <w:b w:val="0"/>
+          <w:bCs w:val="0"/>
+          <w:i w:val="1"/>
+          <w:iCs w:val="1"/>
+          <w:color w:val="2f6b24"/>
+          <w:sz w:val="24"/>
+          <w:szCs w:val="24"/>
+        </w:rPr>
+        <w:t xml:space="preserve">openssl rand -hex 16</w:t>
       </w:r>
       <w:r>
         <w:rPr>

</xml_diff>

<commit_message>
docs(entrega2): align tag name and scanned route count in the report
</commit_message>
<xml_diff>
--- a/documentos/Entrega2/Redes de Computadores e Cibersegurança/Entrega-2-Relatorio-de-Mitigacao-de-Riscos-Smash.docx
+++ b/documentos/Entrega2/Redes de Computadores e Cibersegurança/Entrega-2-Relatorio-de-Mitigacao-de-Riscos-Smash.docx
@@ -2403,7 +2403,7 @@
           <w:sz w:val="24"/>
           <w:szCs w:val="24"/>
         </w:rPr>
-        <w:t xml:space="preserve"> o OWASP ZAP examinou a API rodando localmente, primeiro no modo baseline e depois em todas as rotas, autenticado e com ataques ativos, a partir da descrição OpenAPI </w:t>
+        <w:t xml:space="preserve"> o OWASP ZAP examinou a API rodando localmente, primeiro no modo baseline e depois nas 8 rotas da descrição OpenAPI </w:t>
       </w:r>
       <w:r>
         <w:rPr>
@@ -2427,7 +2427,7 @@
           <w:sz w:val="24"/>
           <w:szCs w:val="24"/>
         </w:rPr>
-        <w:t xml:space="preserve">.</w:t>
+        <w:t xml:space="preserve">, autenticado e com ataques ativos. A API tem 9 rotas; só a saída da conta ficou de fora.</w:t>
       </w:r>
     </w:p>
     <w:p>
@@ -9357,7 +9357,7 @@
                 <w:sz w:val="19"/>
                 <w:szCs w:val="19"/>
               </w:rPr>
-              <w:t xml:space="preserve">OWASP ZAP 2.16, todas as rotas</w:t>
+              <w:t xml:space="preserve">OWASP ZAP 2.16, API completa</w:t>
             </w:r>
           </w:p>
         </w:tc>
@@ -9385,7 +9385,7 @@
                 <w:sz w:val="19"/>
                 <w:szCs w:val="19"/>
               </w:rPr>
-              <w:t xml:space="preserve">Ataques ativos (injeção, XSS e outros) nas 9 rotas da API, autenticado com um token de teste</w:t>
+              <w:t xml:space="preserve">Ataques ativos (injeção, XSS e outros) nas 8 rotas da descrição OpenAPI (o ZAP registrou 12 URLs ao importá-la), autenticado com um token de teste</w:t>
             </w:r>
           </w:p>
         </w:tc>
@@ -25911,7 +25911,7 @@
           <w:sz w:val="15"/>
           <w:szCs w:val="15"/>
         </w:rPr>
-        <w:t xml:space="preserve">$ cd backend &amp;&amp; npm audit --omit=dev   # depois: tag entrega2-ciberseguranca</w:t>
+        <w:t xml:space="preserve">$ cd backend &amp;&amp; npm audit --omit=dev   # depois: tag entrega2-ciberseguranca-final</w:t>
       </w:r>
     </w:p>
     <w:p>
@@ -25987,7 +25987,7 @@
           <w:sz w:val="15"/>
           <w:szCs w:val="15"/>
         </w:rPr>
-        <w:t xml:space="preserve">$ cd frontend &amp;&amp; npm audit --omit=dev   # depois: tag entrega2-ciberseguranca</w:t>
+        <w:t xml:space="preserve">$ cd frontend &amp;&amp; npm audit --omit=dev   # depois: tag entrega2-ciberseguranca-final</w:t>
       </w:r>
     </w:p>
     <w:p>

</xml_diff>